<commit_message>
feat: v14 — labs adopt the official IoTFlow Python client (pip install iotflow)
- Lab 2: pip install "iotflow[mqtt]", HTTP send()/virtual_write(), and the
  telemetry_upload.py MQTT example (Python equivalent of the ESP8266 sketch)
- Lab 4: @iot.on_command handler with iot.run() HTTP polling and
  iot.loop_forever() MQTT variants; Arduino onCommand kept as hardware alternative
- PPT v14 (151 slides): Python-client tile grid + downloads/references slides,
  taller code boxes on step slides
- LG: step-by-step client install section + full telemetry_upload.py script;
  per-lab step numbering now restarts at 1; VCR v14 rows in LG/LP
- labs/*.md: pip prerequisite + PyPI/source links; README updated to v14
- PDFs regenerated (deck 151 pp; LG/LP with populated TOCs)

Co-Authored-By: Claude Fable 5 <noreply@anthropic.com>
</commit_message>
<xml_diff>
--- a/courseware/LG-IoT-Fundamental-for-Beginners.docx
+++ b/courseware/LG-IoT-Fundamental-for-Beginners.docx
@@ -179,7 +179,7 @@
           <w:color w:val="1F6FEB"/>
           <w:sz w:val="24"/>
         </w:rPr>
-        <w:t>Version 13</w:t>
+        <w:t>Version 14</w:t>
       </w:r>
     </w:p>
     <w:p>
@@ -399,6 +399,64 @@
           </w:p>
         </w:tc>
       </w:tr>
+      <w:tr>
+        <w:tc>
+          <w:tcPr>
+            <w:tcW w:type="dxa" w:w="2160"/>
+          </w:tcPr>
+          <w:p>
+            <w:r/>
+            <w:r>
+              <w:rPr>
+                <w:sz w:val="19"/>
+              </w:rPr>
+              <w:t>14</w:t>
+            </w:r>
+          </w:p>
+        </w:tc>
+        <w:tc>
+          <w:tcPr>
+            <w:tcW w:type="dxa" w:w="2160"/>
+          </w:tcPr>
+          <w:p>
+            <w:r/>
+            <w:r>
+              <w:rPr>
+                <w:sz w:val="19"/>
+              </w:rPr>
+              <w:t>6 July 2026</w:t>
+            </w:r>
+          </w:p>
+        </w:tc>
+        <w:tc>
+          <w:tcPr>
+            <w:tcW w:type="dxa" w:w="2160"/>
+          </w:tcPr>
+          <w:p>
+            <w:r/>
+            <w:r>
+              <w:rPr>
+                <w:sz w:val="19"/>
+              </w:rPr>
+              <w:t>Labs updated to the official IoTFlow Python client (pip install iotflow): send()/virtual_write() over HTTP, the telemetry_upload.py MQTT example, and @on_command control handlers; added the Python client setup section with the full example script.</w:t>
+            </w:r>
+          </w:p>
+        </w:tc>
+        <w:tc>
+          <w:tcPr>
+            <w:tcW w:type="dxa" w:w="2160"/>
+          </w:tcPr>
+          <w:p>
+            <w:r/>
+            <w:r>
+              <w:rPr>
+                <w:sz w:val="19"/>
+              </w:rPr>
+              <w:t>Dr. Alfred Ang</w:t>
+            </w:r>
+          </w:p>
+        </w:tc>
+      </w:tr>
     </w:tbl>
     <w:p>
       <w:r>
@@ -819,6 +877,515 @@
           <w:color w:val="1F6FEB"/>
           <w:sz w:val="22"/>
         </w:rPr>
+        <w:t>Install the IoTFlow Python client (pip install iotflow)</w:t>
+      </w:r>
+    </w:p>
+    <w:p>
+      <w:r>
+        <w:t>The official Python client connects any device that runs Python (Raspberry Pi, PC, Mac, Linux SBCs) to the platform. For microcontrollers (Arduino, ESP8266, ESP32) use the Arduino library — both speak the same protocol. Install it once before Lab 2:</w:t>
+      </w:r>
+    </w:p>
+    <w:p>
+      <w:pPr>
+        <w:ind w:left="461" w:hanging="461"/>
+      </w:pPr>
+      <w:r>
+        <w:rPr>
+          <w:b/>
+        </w:rPr>
+        <w:t>1.</w:t>
+      </w:r>
+      <w:r>
+        <w:t xml:space="preserve">  Open a terminal (macOS/Linux: Terminal; Windows: Command Prompt or PowerShell) and check that Python 3 is installed.</w:t>
+      </w:r>
+    </w:p>
+    <w:p>
+      <w:r>
+        <w:rPr>
+          <w:rFonts w:ascii="Consolas" w:hAnsi="Consolas"/>
+          <w:color w:val="0B3060"/>
+          <w:sz w:val="19"/>
+        </w:rPr>
+        <w:t>python --version    # or: python3 --version</w:t>
+      </w:r>
+    </w:p>
+    <w:p>
+      <w:pPr>
+        <w:ind w:left="461" w:hanging="461"/>
+      </w:pPr>
+      <w:r>
+        <w:rPr>
+          <w:b/>
+        </w:rPr>
+        <w:t>2.</w:t>
+      </w:r>
+      <w:r>
+        <w:t xml:space="preserve">  Install the client with MQTT support (recommended for this course).</w:t>
+      </w:r>
+    </w:p>
+    <w:p>
+      <w:r>
+        <w:rPr>
+          <w:rFonts w:ascii="Consolas" w:hAnsi="Consolas"/>
+          <w:color w:val="0B3060"/>
+          <w:sz w:val="19"/>
+        </w:rPr>
+        <w:t>pip install "iotflow[mqtt]"</w:t>
+      </w:r>
+    </w:p>
+    <w:p>
+      <w:pPr>
+        <w:ind w:left="461" w:hanging="461"/>
+      </w:pPr>
+      <w:r>
+        <w:rPr>
+          <w:b/>
+        </w:rPr>
+        <w:t>3.</w:t>
+      </w:r>
+      <w:r>
+        <w:t xml:space="preserve">  Alternative — HTTP-only install (zero dependencies) if pip cannot reach paho-mqtt.</w:t>
+      </w:r>
+    </w:p>
+    <w:p>
+      <w:r>
+        <w:rPr>
+          <w:rFonts w:ascii="Consolas" w:hAnsi="Consolas"/>
+          <w:color w:val="0B3060"/>
+          <w:sz w:val="19"/>
+        </w:rPr>
+        <w:t>pip install iotflow</w:t>
+      </w:r>
+    </w:p>
+    <w:p>
+      <w:pPr>
+        <w:ind w:left="461" w:hanging="461"/>
+      </w:pPr>
+      <w:r>
+        <w:rPr>
+          <w:b/>
+        </w:rPr>
+        <w:t>4.</w:t>
+      </w:r>
+      <w:r>
+        <w:t xml:space="preserve">  Verify the installation — the import must succeed silently.</w:t>
+      </w:r>
+    </w:p>
+    <w:p>
+      <w:r>
+        <w:rPr>
+          <w:rFonts w:ascii="Consolas" w:hAnsi="Consolas"/>
+          <w:color w:val="0B3060"/>
+          <w:sz w:val="19"/>
+        </w:rPr>
+        <w:t>python -c "from iotflow import IoTFlow; print('iotflow OK')"</w:t>
+      </w:r>
+    </w:p>
+    <w:p>
+      <w:r>
+        <w:t>Package on PyPI: https://pypi.org/project/iotflow/  ·  Source, README and examples: https://github.com/alfredang/iotplatform/tree/main/clients/python</w:t>
+      </w:r>
+    </w:p>
+    <w:p>
+      <w:r>
+        <w:rPr>
+          <w:b/>
+          <w:color w:val="1F6FEB"/>
+          <w:sz w:val="22"/>
+        </w:rPr>
+        <w:t>The telemetry_upload.py example script (used in Lab 2)</w:t>
+      </w:r>
+    </w:p>
+    <w:p>
+      <w:r>
+        <w:t>This is the Python equivalent of the ESP8266_Telemetry_Upload Arduino sketch — it connects to the MQTT broker and publishes a reading every 10 seconds. Download it, fill in your broker host, device id and device token from the Add Device wizard, then run it:</w:t>
+      </w:r>
+    </w:p>
+    <w:p>
+      <w:r>
+        <w:rPr>
+          <w:rFonts w:ascii="Consolas" w:hAnsi="Consolas"/>
+          <w:color w:val="0B3060"/>
+          <w:sz w:val="19"/>
+        </w:rPr>
+        <w:t>curl -O https://raw.githubusercontent.com/alfredang/iotplatform/main/clients/python/examples/telemetry_upload.py</w:t>
+      </w:r>
+    </w:p>
+    <w:p>
+      <w:r>
+        <w:rPr>
+          <w:rFonts w:ascii="Consolas" w:hAnsi="Consolas"/>
+          <w:color w:val="0B3060"/>
+          <w:sz w:val="19"/>
+        </w:rPr>
+        <w:t>python telemetry_upload.py</w:t>
+      </w:r>
+    </w:p>
+    <w:p>
+      <w:r>
+        <w:rPr>
+          <w:rFonts w:ascii="Consolas" w:hAnsi="Consolas"/>
+          <w:color w:val="0B3060"/>
+          <w:sz w:val="19"/>
+        </w:rPr>
+        <w:t>import random</w:t>
+      </w:r>
+    </w:p>
+    <w:p>
+      <w:r>
+        <w:rPr>
+          <w:rFonts w:ascii="Consolas" w:hAnsi="Consolas"/>
+          <w:color w:val="0B3060"/>
+          <w:sz w:val="19"/>
+        </w:rPr>
+        <w:t>import time</w:t>
+      </w:r>
+    </w:p>
+    <w:p>
+      <w:r>
+        <w:rPr>
+          <w:rFonts w:ascii="Consolas" w:hAnsi="Consolas"/>
+          <w:color w:val="0B3060"/>
+          <w:sz w:val="19"/>
+        </w:rPr>
+      </w:r>
+    </w:p>
+    <w:p>
+      <w:r>
+        <w:rPr>
+          <w:rFonts w:ascii="Consolas" w:hAnsi="Consolas"/>
+          <w:color w:val="0B3060"/>
+          <w:sz w:val="19"/>
+        </w:rPr>
+        <w:t>from iotflow import IoTFlow</w:t>
+      </w:r>
+    </w:p>
+    <w:p>
+      <w:r>
+        <w:rPr>
+          <w:rFonts w:ascii="Consolas" w:hAnsi="Consolas"/>
+          <w:color w:val="0B3060"/>
+          <w:sz w:val="19"/>
+        </w:rPr>
+      </w:r>
+    </w:p>
+    <w:p>
+      <w:r>
+        <w:rPr>
+          <w:rFonts w:ascii="Consolas" w:hAnsi="Consolas"/>
+          <w:color w:val="0B3060"/>
+          <w:sz w:val="19"/>
+        </w:rPr>
+        <w:t># ---- MQTT broker ----</w:t>
+      </w:r>
+    </w:p>
+    <w:p>
+      <w:r>
+        <w:rPr>
+          <w:rFonts w:ascii="Consolas" w:hAnsi="Consolas"/>
+          <w:color w:val="0B3060"/>
+          <w:sz w:val="19"/>
+        </w:rPr>
+        <w:t># Use the course platform broker. (For a self-hosted broker on your LAN,</w:t>
+      </w:r>
+    </w:p>
+    <w:p>
+      <w:r>
+        <w:rPr>
+          <w:rFonts w:ascii="Consolas" w:hAnsi="Consolas"/>
+          <w:color w:val="0B3060"/>
+          <w:sz w:val="19"/>
+        </w:rPr>
+        <w:t># use that machine's IP instead — find it with `ipconfig` / `ifconfig`.)</w:t>
+      </w:r>
+    </w:p>
+    <w:p>
+      <w:r>
+        <w:rPr>
+          <w:rFonts w:ascii="Consolas" w:hAnsi="Consolas"/>
+          <w:color w:val="0B3060"/>
+          <w:sz w:val="19"/>
+        </w:rPr>
+        <w:t>MQTT_BROKER = "iot.tertiaryinfotech.com"</w:t>
+      </w:r>
+    </w:p>
+    <w:p>
+      <w:r>
+        <w:rPr>
+          <w:rFonts w:ascii="Consolas" w:hAnsi="Consolas"/>
+          <w:color w:val="0B3060"/>
+          <w:sz w:val="19"/>
+        </w:rPr>
+        <w:t>MQTT_PORT = 1883</w:t>
+      </w:r>
+    </w:p>
+    <w:p>
+      <w:r>
+        <w:rPr>
+          <w:rFonts w:ascii="Consolas" w:hAnsi="Consolas"/>
+          <w:color w:val="0B3060"/>
+          <w:sz w:val="19"/>
+        </w:rPr>
+      </w:r>
+    </w:p>
+    <w:p>
+      <w:r>
+        <w:rPr>
+          <w:rFonts w:ascii="Consolas" w:hAnsi="Consolas"/>
+          <w:color w:val="0B3060"/>
+          <w:sz w:val="19"/>
+        </w:rPr>
+        <w:t># ---- Device identity (from the "Add Device" wizard in IoTFlow) ----</w:t>
+      </w:r>
+    </w:p>
+    <w:p>
+      <w:r>
+        <w:rPr>
+          <w:rFonts w:ascii="Consolas" w:hAnsi="Consolas"/>
+          <w:color w:val="0B3060"/>
+          <w:sz w:val="19"/>
+        </w:rPr>
+        <w:t>DEVICE_ID = "test-device"</w:t>
+      </w:r>
+    </w:p>
+    <w:p>
+      <w:r>
+        <w:rPr>
+          <w:rFonts w:ascii="Consolas" w:hAnsi="Consolas"/>
+          <w:color w:val="0B3060"/>
+          <w:sz w:val="19"/>
+        </w:rPr>
+        <w:t>DEVICE_TOKEN = "dev_XXXXXXXXXXXXXXXXXXXXXXXXXXXXXXXX"</w:t>
+      </w:r>
+    </w:p>
+    <w:p>
+      <w:r>
+        <w:rPr>
+          <w:rFonts w:ascii="Consolas" w:hAnsi="Consolas"/>
+          <w:color w:val="0B3060"/>
+          <w:sz w:val="19"/>
+        </w:rPr>
+      </w:r>
+    </w:p>
+    <w:p>
+      <w:r>
+        <w:rPr>
+          <w:rFonts w:ascii="Consolas" w:hAnsi="Consolas"/>
+          <w:color w:val="0B3060"/>
+          <w:sz w:val="19"/>
+        </w:rPr>
+        <w:t>PUBLISH_INTERVAL_S = 10</w:t>
+      </w:r>
+    </w:p>
+    <w:p>
+      <w:r>
+        <w:rPr>
+          <w:rFonts w:ascii="Consolas" w:hAnsi="Consolas"/>
+          <w:color w:val="0B3060"/>
+          <w:sz w:val="19"/>
+        </w:rPr>
+      </w:r>
+    </w:p>
+    <w:p>
+      <w:r>
+        <w:rPr>
+          <w:rFonts w:ascii="Consolas" w:hAnsi="Consolas"/>
+          <w:color w:val="0B3060"/>
+          <w:sz w:val="19"/>
+        </w:rPr>
+        <w:t>iot = IoTFlow(</w:t>
+      </w:r>
+    </w:p>
+    <w:p>
+      <w:r>
+        <w:rPr>
+          <w:rFonts w:ascii="Consolas" w:hAnsi="Consolas"/>
+          <w:color w:val="0B3060"/>
+          <w:sz w:val="19"/>
+        </w:rPr>
+        <w:t xml:space="preserve">    token=DEVICE_TOKEN,</w:t>
+      </w:r>
+    </w:p>
+    <w:p>
+      <w:r>
+        <w:rPr>
+          <w:rFonts w:ascii="Consolas" w:hAnsi="Consolas"/>
+          <w:color w:val="0B3060"/>
+          <w:sz w:val="19"/>
+        </w:rPr>
+        <w:t xml:space="preserve">    device_id=DEVICE_ID,</w:t>
+      </w:r>
+    </w:p>
+    <w:p>
+      <w:r>
+        <w:rPr>
+          <w:rFonts w:ascii="Consolas" w:hAnsi="Consolas"/>
+          <w:color w:val="0B3060"/>
+          <w:sz w:val="19"/>
+        </w:rPr>
+        <w:t xml:space="preserve">    mqtt_host=MQTT_BROKER,</w:t>
+      </w:r>
+    </w:p>
+    <w:p>
+      <w:r>
+        <w:rPr>
+          <w:rFonts w:ascii="Consolas" w:hAnsi="Consolas"/>
+          <w:color w:val="0B3060"/>
+          <w:sz w:val="19"/>
+        </w:rPr>
+        <w:t xml:space="preserve">    mqtt_port=MQTT_PORT,</w:t>
+      </w:r>
+    </w:p>
+    <w:p>
+      <w:r>
+        <w:rPr>
+          <w:rFonts w:ascii="Consolas" w:hAnsi="Consolas"/>
+          <w:color w:val="0B3060"/>
+          <w:sz w:val="19"/>
+        </w:rPr>
+        <w:t>)</w:t>
+      </w:r>
+    </w:p>
+    <w:p>
+      <w:r>
+        <w:rPr>
+          <w:rFonts w:ascii="Consolas" w:hAnsi="Consolas"/>
+          <w:color w:val="0B3060"/>
+          <w:sz w:val="19"/>
+        </w:rPr>
+        <w:t>iot.connect()  # MQTT connection runs in the background</w:t>
+      </w:r>
+    </w:p>
+    <w:p>
+      <w:r>
+        <w:rPr>
+          <w:rFonts w:ascii="Consolas" w:hAnsi="Consolas"/>
+          <w:color w:val="0B3060"/>
+          <w:sz w:val="19"/>
+        </w:rPr>
+        <w:t>print(f"Connected to MQTT broker {MQTT_BROKER}:{MQTT_PORT}")</w:t>
+      </w:r>
+    </w:p>
+    <w:p>
+      <w:r>
+        <w:rPr>
+          <w:rFonts w:ascii="Consolas" w:hAnsi="Consolas"/>
+          <w:color w:val="0B3060"/>
+          <w:sz w:val="19"/>
+        </w:rPr>
+      </w:r>
+    </w:p>
+    <w:p>
+      <w:r>
+        <w:rPr>
+          <w:rFonts w:ascii="Consolas" w:hAnsi="Consolas"/>
+          <w:color w:val="0B3060"/>
+          <w:sz w:val="19"/>
+        </w:rPr>
+        <w:t>while True:</w:t>
+      </w:r>
+    </w:p>
+    <w:p>
+      <w:r>
+        <w:rPr>
+          <w:rFonts w:ascii="Consolas" w:hAnsi="Consolas"/>
+          <w:color w:val="0B3060"/>
+          <w:sz w:val="19"/>
+        </w:rPr>
+        <w:t xml:space="preserve">    # TODO: replace with real sensor readings (DHT22, BME280, ADC, ...)</w:t>
+      </w:r>
+    </w:p>
+    <w:p>
+      <w:r>
+        <w:rPr>
+          <w:rFonts w:ascii="Consolas" w:hAnsi="Consolas"/>
+          <w:color w:val="0B3060"/>
+          <w:sz w:val="19"/>
+        </w:rPr>
+        <w:t xml:space="preserve">    temperature = round(28.5 + random.uniform(-1.0, 1.0), 1)</w:t>
+      </w:r>
+    </w:p>
+    <w:p>
+      <w:r>
+        <w:rPr>
+          <w:rFonts w:ascii="Consolas" w:hAnsi="Consolas"/>
+          <w:color w:val="0B3060"/>
+          <w:sz w:val="19"/>
+        </w:rPr>
+        <w:t xml:space="preserve">    humidity = round(65 + random.uniform(-5.0, 5.0), 1)</w:t>
+      </w:r>
+    </w:p>
+    <w:p>
+      <w:r>
+        <w:rPr>
+          <w:rFonts w:ascii="Consolas" w:hAnsi="Consolas"/>
+          <w:color w:val="0B3060"/>
+          <w:sz w:val="19"/>
+        </w:rPr>
+        <w:t xml:space="preserve">    voltage = 3.7</w:t>
+      </w:r>
+    </w:p>
+    <w:p>
+      <w:r>
+        <w:rPr>
+          <w:rFonts w:ascii="Consolas" w:hAnsi="Consolas"/>
+          <w:color w:val="0B3060"/>
+          <w:sz w:val="19"/>
+        </w:rPr>
+      </w:r>
+    </w:p>
+    <w:p>
+      <w:r>
+        <w:rPr>
+          <w:rFonts w:ascii="Consolas" w:hAnsi="Consolas"/>
+          <w:color w:val="0B3060"/>
+          <w:sz w:val="19"/>
+        </w:rPr>
+        <w:t xml:space="preserve">    iot.mqtt_publish(temperature=temperature, humidity=humidity, voltage=voltage)</w:t>
+      </w:r>
+    </w:p>
+    <w:p>
+      <w:r>
+        <w:rPr>
+          <w:rFonts w:ascii="Consolas" w:hAnsi="Consolas"/>
+          <w:color w:val="0B3060"/>
+          <w:sz w:val="19"/>
+        </w:rPr>
+        <w:t xml:space="preserve">    print(f"Published: temperature={temperature} humidity={humidity} voltage={voltage}")</w:t>
+      </w:r>
+    </w:p>
+    <w:p>
+      <w:r>
+        <w:rPr>
+          <w:rFonts w:ascii="Consolas" w:hAnsi="Consolas"/>
+          <w:color w:val="0B3060"/>
+          <w:sz w:val="19"/>
+        </w:rPr>
+        <w:t xml:space="preserve">    time.sleep(PUBLISH_INTERVAL_S)</w:t>
+      </w:r>
+    </w:p>
+    <w:p>
+      <w:r>
+        <w:rPr>
+          <w:b/>
+          <w:color w:val="1F6FEB"/>
+        </w:rPr>
+        <w:t xml:space="preserve">Note: </w:t>
+      </w:r>
+      <w:r>
+        <w:rPr>
+          <w:sz w:val="20"/>
+        </w:rPr>
+        <w:t>Example script on GitHub: https://github.com/alfredang/iotplatform/blob/main/clients/python/examples/telemetry_upload.py — the Arduino original it mirrors: https://github.com/alfredang/iotplatform/blob/main/clients/arduino/IoTFlow/examples/ESP8266_Telemetry_Upload/ESP8266_Telemetry_Upload.ino</w:t>
+      </w:r>
+    </w:p>
+    <w:p>
+      <w:r>
+        <w:rPr>
+          <w:b/>
+          <w:color w:val="1F6FEB"/>
+          <w:sz w:val="22"/>
+        </w:rPr>
         <w:t>Conventions used in every lab</w:t>
       </w:r>
     </w:p>
@@ -844,6 +1411,14 @@
       </w:pPr>
       <w:r>
         <w:t>MQTT broker: iot.tertiaryinfotech.com, port 1883.  REST endpoint: /api/telemetry.</w:t>
+      </w:r>
+    </w:p>
+    <w:p>
+      <w:pPr>
+        <w:pStyle w:val="ListBullet"/>
+      </w:pPr>
+      <w:r>
+        <w:t>Python code uses the official client: pip install "iotflow[mqtt]" — send()/virtual_write() over HTTP, connect()/mqtt_publish() over MQTT, @on_command for control.</w:t>
       </w:r>
     </w:p>
     <w:p>
@@ -977,6 +1552,22 @@
       </w:pPr>
       <w:r>
         <w:t>Telemetry is a simple JSON document of metric key-value pairs, e.g. {"temperature": 22.5, "humidity": 60}.</w:t>
+      </w:r>
+    </w:p>
+    <w:p>
+      <w:pPr>
+        <w:pStyle w:val="ListBullet"/>
+      </w:pPr>
+      <w:r>
+        <w:t>Official device clients: the Python client — pip install iotflow — for Raspberry Pi/PC/Mac, and the Arduino library for ESP8266/ESP32; both speak the same protocol.</w:t>
+      </w:r>
+    </w:p>
+    <w:p>
+      <w:pPr>
+        <w:pStyle w:val="ListBullet"/>
+      </w:pPr>
+      <w:r>
+        <w:t>The Python client sends with send()/virtual_write() over HTTP, streams with connect()/mqtt_publish() over MQTT, and reacts to commands with @on_command.</w:t>
       </w:r>
     </w:p>
     <w:p>
@@ -1070,10 +1661,16 @@
     </w:p>
     <w:p>
       <w:pPr>
-        <w:pStyle w:val="ListNumber"/>
-      </w:pPr>
-      <w:r>
-        <w:t>Open the IoTFlow platform and sign up for a free account (or log in).</w:t>
+        <w:ind w:left="461" w:hanging="461"/>
+      </w:pPr>
+      <w:r>
+        <w:rPr>
+          <w:b/>
+        </w:rPr>
+        <w:t>1.</w:t>
+      </w:r>
+      <w:r>
+        <w:t xml:space="preserve">  Open the IoTFlow platform and sign up for a free account (or log in).</w:t>
       </w:r>
     </w:p>
     <w:p>
@@ -1088,18 +1685,30 @@
     </w:p>
     <w:p>
       <w:pPr>
-        <w:pStyle w:val="ListNumber"/>
-      </w:pPr>
-      <w:r>
-        <w:t>Pick or create a project — a self-contained workspace with its own dashboard, alerts, map and automations. Use the project switcher at the top of the sidebar.</w:t>
-      </w:r>
-    </w:p>
-    <w:p>
-      <w:pPr>
-        <w:pStyle w:val="ListNumber"/>
-      </w:pPr>
-      <w:r>
-        <w:t>Click Add Device in the sidebar and give your device a descriptive name.</w:t>
+        <w:ind w:left="461" w:hanging="461"/>
+      </w:pPr>
+      <w:r>
+        <w:rPr>
+          <w:b/>
+        </w:rPr>
+        <w:t>2.</w:t>
+      </w:r>
+      <w:r>
+        <w:t xml:space="preserve">  Pick or create a project — a self-contained workspace with its own dashboard, alerts, map and automations. Use the project switcher at the top of the sidebar.</w:t>
+      </w:r>
+    </w:p>
+    <w:p>
+      <w:pPr>
+        <w:ind w:left="461" w:hanging="461"/>
+      </w:pPr>
+      <w:r>
+        <w:rPr>
+          <w:b/>
+        </w:rPr>
+        <w:t>3.</w:t>
+      </w:r>
+      <w:r>
+        <w:t xml:space="preserve">  Click Add Device in the sidebar and give your device a descriptive name.</w:t>
       </w:r>
     </w:p>
     <w:p>
@@ -1114,18 +1723,30 @@
     </w:p>
     <w:p>
       <w:pPr>
-        <w:pStyle w:val="ListNumber"/>
-      </w:pPr>
-      <w:r>
-        <w:t>Follow the six-step guided wizard and choose a protocol: HTTP — simplest, POST JSON to a REST endpoint; or MQTT — lightweight pub/sub, ideal for many devices and real-time control. Both remain available later.</w:t>
-      </w:r>
-    </w:p>
-    <w:p>
-      <w:pPr>
-        <w:pStyle w:val="ListNumber"/>
-      </w:pPr>
-      <w:r>
-        <w:t>Copy the device token shown when the device is created — it is displayed only once.</w:t>
+        <w:ind w:left="461" w:hanging="461"/>
+      </w:pPr>
+      <w:r>
+        <w:rPr>
+          <w:b/>
+        </w:rPr>
+        <w:t>4.</w:t>
+      </w:r>
+      <w:r>
+        <w:t xml:space="preserve">  Follow the six-step guided wizard and choose a protocol: HTTP — simplest, POST JSON to a REST endpoint; or MQTT — lightweight pub/sub, ideal for many devices and real-time control. Both remain available later.</w:t>
+      </w:r>
+    </w:p>
+    <w:p>
+      <w:pPr>
+        <w:ind w:left="461" w:hanging="461"/>
+      </w:pPr>
+      <w:r>
+        <w:rPr>
+          <w:b/>
+        </w:rPr>
+        <w:t>5.</w:t>
+      </w:r>
+      <w:r>
+        <w:t xml:space="preserve">  Copy the device token shown when the device is created — it is displayed only once.</w:t>
       </w:r>
     </w:p>
     <w:p>
@@ -1140,10 +1761,16 @@
     </w:p>
     <w:p>
       <w:pPr>
-        <w:pStyle w:val="ListNumber"/>
-      </w:pPr>
-      <w:r>
-        <w:t>Understand how the token authenticates every message your device sends.</w:t>
+        <w:ind w:left="461" w:hanging="461"/>
+      </w:pPr>
+      <w:r>
+        <w:rPr>
+          <w:b/>
+        </w:rPr>
+        <w:t>6.</w:t>
+      </w:r>
+      <w:r>
+        <w:t xml:space="preserve">  Understand how the token authenticates every message your device sends.</w:t>
       </w:r>
     </w:p>
     <w:p>
@@ -1217,7 +1844,7 @@
     </w:p>
     <w:p>
       <w:r>
-        <w:t>Live temperature &amp; humidity telemetry streaming into IoTFlow from terminal, Python and ESP32   (Uses: Telemetry REST API, Python iotflow client, ESP32/ESP8266 Arduino library, MQTT broker (port 1883).)</w:t>
+        <w:t>Live temperature &amp; humidity telemetry streaming into IoTFlow from terminal, Python and ESP32   (Uses: Telemetry REST API, Python client (pip install iotflow), ESP32/ESP8266 Arduino library, MQTT broker (port 1883).)</w:t>
       </w:r>
     </w:p>
     <w:p>
@@ -1278,18 +1905,30 @@
     </w:p>
     <w:p>
       <w:pPr>
-        <w:pStyle w:val="ListNumber"/>
-      </w:pPr>
-      <w:r>
-        <w:t>Open the Integrate page for your device — every snippet comes pre-filled with your endpoint and device token.</w:t>
-      </w:r>
-    </w:p>
-    <w:p>
-      <w:pPr>
-        <w:pStyle w:val="ListNumber"/>
-      </w:pPr>
-      <w:r>
-        <w:t>Send your first reading from any terminal with cURL (HTTP POST).</w:t>
+        <w:ind w:left="461" w:hanging="461"/>
+      </w:pPr>
+      <w:r>
+        <w:rPr>
+          <w:b/>
+        </w:rPr>
+        <w:t>1.</w:t>
+      </w:r>
+      <w:r>
+        <w:t xml:space="preserve">  Open the Integrate page for your device — every snippet comes pre-filled with your endpoint and device token.</w:t>
+      </w:r>
+    </w:p>
+    <w:p>
+      <w:pPr>
+        <w:ind w:left="461" w:hanging="461"/>
+      </w:pPr>
+      <w:r>
+        <w:rPr>
+          <w:b/>
+        </w:rPr>
+        <w:t>2.</w:t>
+      </w:r>
+      <w:r>
+        <w:t xml:space="preserve">  Send your first reading from any terminal with cURL (HTTP POST).</w:t>
       </w:r>
     </w:p>
     <w:p>
@@ -1334,18 +1973,30 @@
     </w:p>
     <w:p>
       <w:pPr>
-        <w:pStyle w:val="ListNumber"/>
-      </w:pPr>
-      <w:r>
-        <w:t>Open the Dashboard — the reading appears under Latest Telemetry within seconds (widgets auto-refresh every 5 s).</w:t>
-      </w:r>
-    </w:p>
-    <w:p>
-      <w:pPr>
-        <w:pStyle w:val="ListNumber"/>
-      </w:pPr>
-      <w:r>
-        <w:t>Send readings from Python using the lightweight iotflow.py client (plain HTTP — no pip install needed).</w:t>
+        <w:ind w:left="461" w:hanging="461"/>
+      </w:pPr>
+      <w:r>
+        <w:rPr>
+          <w:b/>
+        </w:rPr>
+        <w:t>3.</w:t>
+      </w:r>
+      <w:r>
+        <w:t xml:space="preserve">  Open the Dashboard — the reading appears under Latest Telemetry within seconds (widgets auto-refresh every 5 s).</w:t>
+      </w:r>
+    </w:p>
+    <w:p>
+      <w:pPr>
+        <w:ind w:left="461" w:hanging="461"/>
+      </w:pPr>
+      <w:r>
+        <w:rPr>
+          <w:b/>
+        </w:rPr>
+        <w:t>4.</w:t>
+      </w:r>
+      <w:r>
+        <w:t xml:space="preserve">  Install the official IoTFlow Python client from PyPI (https://pypi.org/project/iotflow/).</w:t>
       </w:r>
     </w:p>
     <w:p>
@@ -1355,7 +2006,7 @@
           <w:color w:val="0B3060"/>
           <w:sz w:val="19"/>
         </w:rPr>
-        <w:t>client = IoTFlow(host, device_token, device_id)</w:t>
+        <w:t>pip install "iotflow[mqtt]"      # with real-time MQTT (paho-mqtt)</w:t>
       </w:r>
     </w:p>
     <w:p>
@@ -1365,15 +2016,202 @@
           <w:color w:val="0B3060"/>
           <w:sz w:val="19"/>
         </w:rPr>
-        <w:t>client.send(temperature=23.1, humidity=58)</w:t>
-      </w:r>
-    </w:p>
-    <w:p>
-      <w:pPr>
-        <w:pStyle w:val="ListNumber"/>
-      </w:pPr>
-      <w:r>
-        <w:t>For real hardware: flash the ESP32/ESP8266 Arduino sketch — set your Wi-Fi SSID/password, the broker host (port 1883) and your device credentials.</w:t>
+        <w:t>pip install iotflow               # HTTP only — zero dependencies</w:t>
+      </w:r>
+    </w:p>
+    <w:p>
+      <w:pPr>
+        <w:ind w:left="461" w:hanging="461"/>
+      </w:pPr>
+      <w:r>
+        <w:rPr>
+          <w:b/>
+        </w:rPr>
+        <w:t>5.</w:t>
+      </w:r>
+      <w:r>
+        <w:t xml:space="preserve">  Send readings from Python over HTTP — several metrics at once with send(), or one at a time with virtual_write().</w:t>
+      </w:r>
+    </w:p>
+    <w:p>
+      <w:r>
+        <w:rPr>
+          <w:rFonts w:ascii="Consolas" w:hAnsi="Consolas"/>
+          <w:color w:val="0B3060"/>
+          <w:sz w:val="19"/>
+        </w:rPr>
+        <w:t>from iotflow import IoTFlow</w:t>
+      </w:r>
+    </w:p>
+    <w:p>
+      <w:r>
+        <w:rPr>
+          <w:rFonts w:ascii="Consolas" w:hAnsi="Consolas"/>
+          <w:color w:val="0B3060"/>
+          <w:sz w:val="19"/>
+        </w:rPr>
+      </w:r>
+    </w:p>
+    <w:p>
+      <w:r>
+        <w:rPr>
+          <w:rFonts w:ascii="Consolas" w:hAnsi="Consolas"/>
+          <w:color w:val="0B3060"/>
+          <w:sz w:val="19"/>
+        </w:rPr>
+        <w:t>iot = IoTFlow("https://iot.tertiaryinfotech.com", "dev_XXXXXXXXXXXX", "living-room-sensor")</w:t>
+      </w:r>
+    </w:p>
+    <w:p>
+      <w:r>
+        <w:rPr>
+          <w:rFonts w:ascii="Consolas" w:hAnsi="Consolas"/>
+          <w:color w:val="0B3060"/>
+          <w:sz w:val="19"/>
+        </w:rPr>
+        <w:t>iot.send(temperature=22.5, humidity=60)      # several metrics at once</w:t>
+      </w:r>
+    </w:p>
+    <w:p>
+      <w:r>
+        <w:rPr>
+          <w:rFonts w:ascii="Consolas" w:hAnsi="Consolas"/>
+          <w:color w:val="0B3060"/>
+          <w:sz w:val="19"/>
+        </w:rPr>
+        <w:t>iot.virtual_write("temperature", 22.5)       # or one at a time</w:t>
+      </w:r>
+    </w:p>
+    <w:p>
+      <w:pPr>
+        <w:ind w:left="461" w:hanging="461"/>
+      </w:pPr>
+      <w:r>
+        <w:rPr>
+          <w:b/>
+        </w:rPr>
+        <w:t>6.</w:t>
+      </w:r>
+      <w:r>
+        <w:t xml:space="preserve">  Stream continuously over MQTT with the telemetry_upload.py example — download it, fill in your broker host, device id and device token, then run it.</w:t>
+      </w:r>
+    </w:p>
+    <w:p>
+      <w:r>
+        <w:rPr>
+          <w:rFonts w:ascii="Consolas" w:hAnsi="Consolas"/>
+          <w:color w:val="0B3060"/>
+          <w:sz w:val="19"/>
+        </w:rPr>
+        <w:t>curl -O https://raw.githubusercontent.com/alfredang/iotplatform/main/clients/python/examples/telemetry_upload.py</w:t>
+      </w:r>
+    </w:p>
+    <w:p>
+      <w:r>
+        <w:rPr>
+          <w:rFonts w:ascii="Consolas" w:hAnsi="Consolas"/>
+          <w:color w:val="0B3060"/>
+          <w:sz w:val="19"/>
+        </w:rPr>
+        <w:t># edit: MQTT_BROKER = "iot.tertiaryinfotech.com", DEVICE_ID, DEVICE_TOKEN</w:t>
+      </w:r>
+    </w:p>
+    <w:p>
+      <w:r>
+        <w:rPr>
+          <w:rFonts w:ascii="Consolas" w:hAnsi="Consolas"/>
+          <w:color w:val="0B3060"/>
+          <w:sz w:val="19"/>
+        </w:rPr>
+        <w:t>python telemetry_upload.py</w:t>
+      </w:r>
+    </w:p>
+    <w:p>
+      <w:pPr>
+        <w:ind w:left="461" w:hanging="461"/>
+      </w:pPr>
+      <w:r>
+        <w:rPr>
+          <w:b/>
+        </w:rPr>
+        <w:t>7.</w:t>
+      </w:r>
+      <w:r>
+        <w:t xml:space="preserve">  Study the loop inside telemetry_upload.py — connect() runs MQTT in the background and mqtt_publish() sends a reading every 10 seconds.</w:t>
+      </w:r>
+    </w:p>
+    <w:p>
+      <w:r>
+        <w:rPr>
+          <w:rFonts w:ascii="Consolas" w:hAnsi="Consolas"/>
+          <w:color w:val="0B3060"/>
+          <w:sz w:val="19"/>
+        </w:rPr>
+        <w:t>iot = IoTFlow(token=DEVICE_TOKEN, device_id=DEVICE_ID,</w:t>
+      </w:r>
+    </w:p>
+    <w:p>
+      <w:r>
+        <w:rPr>
+          <w:rFonts w:ascii="Consolas" w:hAnsi="Consolas"/>
+          <w:color w:val="0B3060"/>
+          <w:sz w:val="19"/>
+        </w:rPr>
+        <w:t xml:space="preserve">              mqtt_host=MQTT_BROKER, mqtt_port=MQTT_PORT)</w:t>
+      </w:r>
+    </w:p>
+    <w:p>
+      <w:r>
+        <w:rPr>
+          <w:rFonts w:ascii="Consolas" w:hAnsi="Consolas"/>
+          <w:color w:val="0B3060"/>
+          <w:sz w:val="19"/>
+        </w:rPr>
+        <w:t>iot.connect()                    # MQTT runs in the background</w:t>
+      </w:r>
+    </w:p>
+    <w:p>
+      <w:r>
+        <w:rPr>
+          <w:rFonts w:ascii="Consolas" w:hAnsi="Consolas"/>
+          <w:color w:val="0B3060"/>
+          <w:sz w:val="19"/>
+        </w:rPr>
+        <w:t>while True:</w:t>
+      </w:r>
+    </w:p>
+    <w:p>
+      <w:r>
+        <w:rPr>
+          <w:rFonts w:ascii="Consolas" w:hAnsi="Consolas"/>
+          <w:color w:val="0B3060"/>
+          <w:sz w:val="19"/>
+        </w:rPr>
+        <w:t xml:space="preserve">    iot.mqtt_publish(temperature=temperature, humidity=humidity, voltage=3.7)</w:t>
+      </w:r>
+    </w:p>
+    <w:p>
+      <w:r>
+        <w:rPr>
+          <w:rFonts w:ascii="Consolas" w:hAnsi="Consolas"/>
+          <w:color w:val="0B3060"/>
+          <w:sz w:val="19"/>
+        </w:rPr>
+        <w:t xml:space="preserve">    time.sleep(PUBLISH_INTERVAL_S)</w:t>
+      </w:r>
+    </w:p>
+    <w:p>
+      <w:pPr>
+        <w:ind w:left="461" w:hanging="461"/>
+      </w:pPr>
+      <w:r>
+        <w:rPr>
+          <w:b/>
+        </w:rPr>
+        <w:t>8.</w:t>
+      </w:r>
+      <w:r>
+        <w:t xml:space="preserve">  Hardware alternative: flash the ESP8266_Telemetry_Upload Arduino sketch — the Arduino library speaks the same protocol as the Python client. Confirm the values update live on the dashboard.</w:t>
       </w:r>
     </w:p>
     <w:p>
@@ -1384,14 +2222,6 @@
           <w:sz w:val="19"/>
         </w:rPr>
         <w:t>IoTFlow.virtualWrite("temperature", t);   // metric name binds to dashboard widgets</w:t>
-      </w:r>
-    </w:p>
-    <w:p>
-      <w:pPr>
-        <w:pStyle w:val="ListNumber"/>
-      </w:pPr>
-      <w:r>
-        <w:t>Let the device publish continuously and confirm the values update live on the dashboard.</w:t>
       </w:r>
     </w:p>
     <w:p>
@@ -1571,10 +2401,16 @@
     </w:p>
     <w:p>
       <w:pPr>
-        <w:pStyle w:val="ListNumber"/>
-      </w:pPr>
-      <w:r>
-        <w:t>Read your device's latest state from any terminal over the REST API.</w:t>
+        <w:ind w:left="461" w:hanging="461"/>
+      </w:pPr>
+      <w:r>
+        <w:rPr>
+          <w:b/>
+        </w:rPr>
+        <w:t>1.</w:t>
+      </w:r>
+      <w:r>
+        <w:t xml:space="preserve">  Read your device's latest state from any terminal over the REST API.</w:t>
       </w:r>
     </w:p>
     <w:p>
@@ -1599,18 +2435,30 @@
     </w:p>
     <w:p>
       <w:pPr>
-        <w:pStyle w:val="ListNumber"/>
-      </w:pPr>
-      <w:r>
-        <w:t>Inspect the JSON reply — the platform returns the current value of every metric and virtual pin.</w:t>
-      </w:r>
-    </w:p>
-    <w:p>
-      <w:pPr>
-        <w:pStyle w:val="ListNumber"/>
-      </w:pPr>
-      <w:r>
-        <w:t>Subscribe to your device's MQTT downlink topic to watch commands and data arrive in real time.</w:t>
+        <w:ind w:left="461" w:hanging="461"/>
+      </w:pPr>
+      <w:r>
+        <w:rPr>
+          <w:b/>
+        </w:rPr>
+        <w:t>2.</w:t>
+      </w:r>
+      <w:r>
+        <w:t xml:space="preserve">  Inspect the JSON reply — the platform returns the current value of every metric and virtual pin.</w:t>
+      </w:r>
+    </w:p>
+    <w:p>
+      <w:pPr>
+        <w:ind w:left="461" w:hanging="461"/>
+      </w:pPr>
+      <w:r>
+        <w:rPr>
+          <w:b/>
+        </w:rPr>
+        <w:t>3.</w:t>
+      </w:r>
+      <w:r>
+        <w:t xml:space="preserve">  Subscribe to your device's MQTT downlink topic to watch commands and data arrive in real time.</w:t>
       </w:r>
     </w:p>
     <w:p>
@@ -1635,26 +2483,44 @@
     </w:p>
     <w:p>
       <w:pPr>
-        <w:pStyle w:val="ListNumber"/>
-      </w:pPr>
-      <w:r>
-        <w:t>Send a fresh reading (Lab 2) and watch it flow through — uplink telemetry vs downlink commands.</w:t>
-      </w:r>
-    </w:p>
-    <w:p>
-      <w:pPr>
-        <w:pStyle w:val="ListNumber"/>
-      </w:pPr>
-      <w:r>
-        <w:t>Open the device page on IoTFlow and review its per-device telemetry history and active alerts.</w:t>
-      </w:r>
-    </w:p>
-    <w:p>
-      <w:pPr>
-        <w:pStyle w:val="ListNumber"/>
-      </w:pPr>
-      <w:r>
-        <w:t>Read the same state from Python and print the values — this is how any external app integrates IoT data.</w:t>
+        <w:ind w:left="461" w:hanging="461"/>
+      </w:pPr>
+      <w:r>
+        <w:rPr>
+          <w:b/>
+        </w:rPr>
+        <w:t>4.</w:t>
+      </w:r>
+      <w:r>
+        <w:t xml:space="preserve">  Send a fresh reading (Lab 2) and watch it flow through — uplink telemetry vs downlink commands.</w:t>
+      </w:r>
+    </w:p>
+    <w:p>
+      <w:pPr>
+        <w:ind w:left="461" w:hanging="461"/>
+      </w:pPr>
+      <w:r>
+        <w:rPr>
+          <w:b/>
+        </w:rPr>
+        <w:t>5.</w:t>
+      </w:r>
+      <w:r>
+        <w:t xml:space="preserve">  Open the device page on IoTFlow and review its per-device telemetry history and active alerts.</w:t>
+      </w:r>
+    </w:p>
+    <w:p>
+      <w:pPr>
+        <w:ind w:left="461" w:hanging="461"/>
+      </w:pPr>
+      <w:r>
+        <w:rPr>
+          <w:b/>
+        </w:rPr>
+        <w:t>6.</w:t>
+      </w:r>
+      <w:r>
+        <w:t xml:space="preserve">  Read the same state from Python and print the values — this is how any external app integrates IoT data.</w:t>
       </w:r>
     </w:p>
     <w:p>
@@ -1748,7 +2614,7 @@
     </w:p>
     <w:p>
       <w:r>
-        <w:t>A dashboard switch and slider that control a relay/LED on the device in real time   (Uses: Control widgets (Button, Switch, Slider, Terminal), virtual pins, MQTT downlink, HTTP polling.)</w:t>
+        <w:t>A dashboard switch and slider that control a relay/LED on the device in real time   (Uses: Control widgets (Button, Switch, Slider, Terminal), virtual pins, Python client @on_command, MQTT downlink, HTTP polling.)</w:t>
       </w:r>
     </w:p>
     <w:p>
@@ -1809,18 +2675,30 @@
     </w:p>
     <w:p>
       <w:pPr>
-        <w:pStyle w:val="ListNumber"/>
-      </w:pPr>
-      <w:r>
-        <w:t>On the Dashboard click Add widget and choose a Control type: Button (momentary), Switch (toggle), Slider (value) or Terminal (text).</w:t>
-      </w:r>
-    </w:p>
-    <w:p>
-      <w:pPr>
-        <w:pStyle w:val="ListNumber"/>
-      </w:pPr>
-      <w:r>
-        <w:t>Assign the virtual pin the widget writes to — e.g. V1, relay or pump. For a slider also set the min/max range.</w:t>
+        <w:ind w:left="461" w:hanging="461"/>
+      </w:pPr>
+      <w:r>
+        <w:rPr>
+          <w:b/>
+        </w:rPr>
+        <w:t>1.</w:t>
+      </w:r>
+      <w:r>
+        <w:t xml:space="preserve">  On the Dashboard click Add widget and choose a Control type: Button (momentary), Switch (toggle), Slider (value) or Terminal (text).</w:t>
+      </w:r>
+    </w:p>
+    <w:p>
+      <w:pPr>
+        <w:ind w:left="461" w:hanging="461"/>
+      </w:pPr>
+      <w:r>
+        <w:rPr>
+          <w:b/>
+        </w:rPr>
+        <w:t>2.</w:t>
+      </w:r>
+      <w:r>
+        <w:t xml:space="preserve">  Assign the virtual pin the widget writes to — e.g. V1, relay or pump. For a slider also set the min/max range.</w:t>
       </w:r>
     </w:p>
     <w:p>
@@ -1835,10 +2713,16 @@
     </w:p>
     <w:p>
       <w:pPr>
-        <w:pStyle w:val="ListNumber"/>
-      </w:pPr>
-      <w:r>
-        <w:t>Understand the downlink path — devices receive commands via MQTT on their command topic, or by HTTP polling.</w:t>
+        <w:ind w:left="461" w:hanging="461"/>
+      </w:pPr>
+      <w:r>
+        <w:rPr>
+          <w:b/>
+        </w:rPr>
+        <w:t>3.</w:t>
+      </w:r>
+      <w:r>
+        <w:t xml:space="preserve">  Understand the downlink path — devices receive commands via MQTT on their command topic, or by HTTP polling.</w:t>
       </w:r>
     </w:p>
     <w:p>
@@ -1853,10 +2737,209 @@
     </w:p>
     <w:p>
       <w:pPr>
-        <w:pStyle w:val="ListNumber"/>
-      </w:pPr>
-      <w:r>
-        <w:t>Implement the command handler in your device sketch and map pins to GPIO outputs.</w:t>
+        <w:ind w:left="461" w:hanging="461"/>
+      </w:pPr>
+      <w:r>
+        <w:rPr>
+          <w:b/>
+        </w:rPr>
+        <w:t>4.</w:t>
+      </w:r>
+      <w:r>
+        <w:t xml:space="preserve">  React to commands in Python with the iotflow client — decorate a handler with @iot.on_command and poll over HTTP (no extra dependencies).</w:t>
+      </w:r>
+    </w:p>
+    <w:p>
+      <w:r>
+        <w:rPr>
+          <w:rFonts w:ascii="Consolas" w:hAnsi="Consolas"/>
+          <w:color w:val="0B3060"/>
+          <w:sz w:val="19"/>
+        </w:rPr>
+        <w:t>from iotflow import IoTFlow</w:t>
+      </w:r>
+    </w:p>
+    <w:p>
+      <w:r>
+        <w:rPr>
+          <w:rFonts w:ascii="Consolas" w:hAnsi="Consolas"/>
+          <w:color w:val="0B3060"/>
+          <w:sz w:val="19"/>
+        </w:rPr>
+      </w:r>
+    </w:p>
+    <w:p>
+      <w:r>
+        <w:rPr>
+          <w:rFonts w:ascii="Consolas" w:hAnsi="Consolas"/>
+          <w:color w:val="0B3060"/>
+          <w:sz w:val="19"/>
+        </w:rPr>
+        <w:t>iot = IoTFlow("https://iot.tertiaryinfotech.com", "dev_XXXXXXXXXXXX", "living-room-sensor")</w:t>
+      </w:r>
+    </w:p>
+    <w:p>
+      <w:r>
+        <w:rPr>
+          <w:rFonts w:ascii="Consolas" w:hAnsi="Consolas"/>
+          <w:color w:val="0B3060"/>
+          <w:sz w:val="19"/>
+        </w:rPr>
+      </w:r>
+    </w:p>
+    <w:p>
+      <w:r>
+        <w:rPr>
+          <w:rFonts w:ascii="Consolas" w:hAnsi="Consolas"/>
+          <w:color w:val="0B3060"/>
+          <w:sz w:val="19"/>
+        </w:rPr>
+        <w:t>@iot.on_command</w:t>
+      </w:r>
+    </w:p>
+    <w:p>
+      <w:r>
+        <w:rPr>
+          <w:rFonts w:ascii="Consolas" w:hAnsi="Consolas"/>
+          <w:color w:val="0B3060"/>
+          <w:sz w:val="19"/>
+        </w:rPr>
+        <w:t>def handle(pin, value, text):</w:t>
+      </w:r>
+    </w:p>
+    <w:p>
+      <w:r>
+        <w:rPr>
+          <w:rFonts w:ascii="Consolas" w:hAnsi="Consolas"/>
+          <w:color w:val="0B3060"/>
+          <w:sz w:val="19"/>
+        </w:rPr>
+        <w:t xml:space="preserve">    if pin == "V1":</w:t>
+      </w:r>
+    </w:p>
+    <w:p>
+      <w:r>
+        <w:rPr>
+          <w:rFonts w:ascii="Consolas" w:hAnsi="Consolas"/>
+          <w:color w:val="0B3060"/>
+          <w:sz w:val="19"/>
+        </w:rPr>
+        <w:t xml:space="preserve">        print("relay -&gt;", value)      # drive a GPIO here</w:t>
+      </w:r>
+    </w:p>
+    <w:p>
+      <w:r>
+        <w:rPr>
+          <w:rFonts w:ascii="Consolas" w:hAnsi="Consolas"/>
+          <w:color w:val="0B3060"/>
+          <w:sz w:val="19"/>
+        </w:rPr>
+      </w:r>
+    </w:p>
+    <w:p>
+      <w:r>
+        <w:rPr>
+          <w:rFonts w:ascii="Consolas" w:hAnsi="Consolas"/>
+          <w:color w:val="0B3060"/>
+          <w:sz w:val="19"/>
+        </w:rPr>
+        <w:t>iot.run(interval=3)                   # blocks, polls every 3 s</w:t>
+      </w:r>
+    </w:p>
+    <w:p>
+      <w:pPr>
+        <w:ind w:left="461" w:hanging="461"/>
+      </w:pPr>
+      <w:r>
+        <w:rPr>
+          <w:b/>
+        </w:rPr>
+        <w:t>5.</w:t>
+      </w:r>
+      <w:r>
+        <w:t xml:space="preserve">  For real-time control, use the same handler over MQTT — loop_forever() keeps the connection open so commands arrive instantly.</w:t>
+      </w:r>
+    </w:p>
+    <w:p>
+      <w:r>
+        <w:rPr>
+          <w:rFonts w:ascii="Consolas" w:hAnsi="Consolas"/>
+          <w:color w:val="0B3060"/>
+          <w:sz w:val="19"/>
+        </w:rPr>
+        <w:t>iot = IoTFlow(token="dev_XXXXXXXXXXXX", device_id="living-room-sensor",</w:t>
+      </w:r>
+    </w:p>
+    <w:p>
+      <w:r>
+        <w:rPr>
+          <w:rFonts w:ascii="Consolas" w:hAnsi="Consolas"/>
+          <w:color w:val="0B3060"/>
+          <w:sz w:val="19"/>
+        </w:rPr>
+        <w:t xml:space="preserve">              mqtt_host="iot.tertiaryinfotech.com", mqtt_port=1883)</w:t>
+      </w:r>
+    </w:p>
+    <w:p>
+      <w:r>
+        <w:rPr>
+          <w:rFonts w:ascii="Consolas" w:hAnsi="Consolas"/>
+          <w:color w:val="0B3060"/>
+          <w:sz w:val="19"/>
+        </w:rPr>
+      </w:r>
+    </w:p>
+    <w:p>
+      <w:r>
+        <w:rPr>
+          <w:rFonts w:ascii="Consolas" w:hAnsi="Consolas"/>
+          <w:color w:val="0B3060"/>
+          <w:sz w:val="19"/>
+        </w:rPr>
+        <w:t>@iot.on_command</w:t>
+      </w:r>
+    </w:p>
+    <w:p>
+      <w:r>
+        <w:rPr>
+          <w:rFonts w:ascii="Consolas" w:hAnsi="Consolas"/>
+          <w:color w:val="0B3060"/>
+          <w:sz w:val="19"/>
+        </w:rPr>
+        <w:t>def handle(pin, value, text): ...</w:t>
+      </w:r>
+    </w:p>
+    <w:p>
+      <w:r>
+        <w:rPr>
+          <w:rFonts w:ascii="Consolas" w:hAnsi="Consolas"/>
+          <w:color w:val="0B3060"/>
+          <w:sz w:val="19"/>
+        </w:rPr>
+      </w:r>
+    </w:p>
+    <w:p>
+      <w:r>
+        <w:rPr>
+          <w:rFonts w:ascii="Consolas" w:hAnsi="Consolas"/>
+          <w:color w:val="0B3060"/>
+          <w:sz w:val="19"/>
+        </w:rPr>
+        <w:t>iot.loop_forever()</w:t>
+      </w:r>
+    </w:p>
+    <w:p>
+      <w:pPr>
+        <w:ind w:left="461" w:hanging="461"/>
+      </w:pPr>
+      <w:r>
+        <w:rPr>
+          <w:b/>
+        </w:rPr>
+        <w:t>6.</w:t>
+      </w:r>
+      <w:r>
+        <w:t xml:space="preserve">  Hardware alternative: implement the same handler in the Arduino sketch and map pins to GPIO outputs.</w:t>
       </w:r>
     </w:p>
     <w:p>
@@ -1891,18 +2974,16 @@
     </w:p>
     <w:p>
       <w:pPr>
-        <w:pStyle w:val="ListNumber"/>
-      </w:pPr>
-      <w:r>
-        <w:t>Flip the switch and move the slider on the dashboard — commands are delivered to the device immediately.</w:t>
-      </w:r>
-    </w:p>
-    <w:p>
-      <w:pPr>
-        <w:pStyle w:val="ListNumber"/>
-      </w:pPr>
-      <w:r>
-        <w:t>Observe the relay/LED respond, and note that the same events can also trigger automations (Lab 6).</w:t>
+        <w:ind w:left="461" w:hanging="461"/>
+      </w:pPr>
+      <w:r>
+        <w:rPr>
+          <w:b/>
+        </w:rPr>
+        <w:t>7.</w:t>
+      </w:r>
+      <w:r>
+        <w:t xml:space="preserve">  Flip the switch and move the slider on the dashboard — commands are delivered to the device immediately; the relay/LED responds. The same events can also trigger automations (Lab 6).</w:t>
       </w:r>
     </w:p>
     <w:p>
@@ -1917,7 +2998,7 @@
     </w:p>
     <w:p>
       <w:r>
-        <w:t>Toggling the dashboard switch changes the relay/LED state within a second, and the slider value arrives in the onCommand handler as you drag it.</w:t>
+        <w:t>Toggling the dashboard switch changes the relay/LED state within a second, and the slider value arrives in your @on_command handler as you drag it.</w:t>
       </w:r>
     </w:p>
     <w:p>
@@ -2082,50 +3163,86 @@
     </w:p>
     <w:p>
       <w:pPr>
-        <w:pStyle w:val="ListNumber"/>
-      </w:pPr>
-      <w:r>
-        <w:t>On the Dashboard click Add widget — widgets are grouped into Display (show data) and Control (send commands).</w:t>
-      </w:r>
-    </w:p>
-    <w:p>
-      <w:pPr>
-        <w:pStyle w:val="ListNumber"/>
-      </w:pPr>
-      <w:r>
-        <w:t>Add a Number card: select your device, choose the metric (temperature) and give the widget a title.</w:t>
-      </w:r>
-    </w:p>
-    <w:p>
-      <w:pPr>
-        <w:pStyle w:val="ListNumber"/>
-      </w:pPr>
-      <w:r>
-        <w:t>Add a Gauge for humidity and set sensible min/max bounds (e.g. 0–100 %).</w:t>
-      </w:r>
-    </w:p>
-    <w:p>
-      <w:pPr>
-        <w:pStyle w:val="ListNumber"/>
-      </w:pPr>
-      <w:r>
-        <w:t>Add a Line chart to plot the temperature history over time.</w:t>
-      </w:r>
-    </w:p>
-    <w:p>
-      <w:pPr>
-        <w:pStyle w:val="ListNumber"/>
-      </w:pPr>
-      <w:r>
-        <w:t>Add an LED indicator (on/off state) and a Map widget if your device reports a location.</w:t>
-      </w:r>
-    </w:p>
-    <w:p>
-      <w:pPr>
-        <w:pStyle w:val="ListNumber"/>
-      </w:pPr>
-      <w:r>
-        <w:t>Arrange the layout — widgets snap into a responsive grid, refresh automatically, and can be removed with the trash icon.</w:t>
+        <w:ind w:left="461" w:hanging="461"/>
+      </w:pPr>
+      <w:r>
+        <w:rPr>
+          <w:b/>
+        </w:rPr>
+        <w:t>1.</w:t>
+      </w:r>
+      <w:r>
+        <w:t xml:space="preserve">  On the Dashboard click Add widget — widgets are grouped into Display (show data) and Control (send commands).</w:t>
+      </w:r>
+    </w:p>
+    <w:p>
+      <w:pPr>
+        <w:ind w:left="461" w:hanging="461"/>
+      </w:pPr>
+      <w:r>
+        <w:rPr>
+          <w:b/>
+        </w:rPr>
+        <w:t>2.</w:t>
+      </w:r>
+      <w:r>
+        <w:t xml:space="preserve">  Add a Number card: select your device, choose the metric (temperature) and give the widget a title.</w:t>
+      </w:r>
+    </w:p>
+    <w:p>
+      <w:pPr>
+        <w:ind w:left="461" w:hanging="461"/>
+      </w:pPr>
+      <w:r>
+        <w:rPr>
+          <w:b/>
+        </w:rPr>
+        <w:t>3.</w:t>
+      </w:r>
+      <w:r>
+        <w:t xml:space="preserve">  Add a Gauge for humidity and set sensible min/max bounds (e.g. 0–100 %).</w:t>
+      </w:r>
+    </w:p>
+    <w:p>
+      <w:pPr>
+        <w:ind w:left="461" w:hanging="461"/>
+      </w:pPr>
+      <w:r>
+        <w:rPr>
+          <w:b/>
+        </w:rPr>
+        <w:t>4.</w:t>
+      </w:r>
+      <w:r>
+        <w:t xml:space="preserve">  Add a Line chart to plot the temperature history over time.</w:t>
+      </w:r>
+    </w:p>
+    <w:p>
+      <w:pPr>
+        <w:ind w:left="461" w:hanging="461"/>
+      </w:pPr>
+      <w:r>
+        <w:rPr>
+          <w:b/>
+        </w:rPr>
+        <w:t>5.</w:t>
+      </w:r>
+      <w:r>
+        <w:t xml:space="preserve">  Add an LED indicator (on/off state) and a Map widget if your device reports a location.</w:t>
+      </w:r>
+    </w:p>
+    <w:p>
+      <w:pPr>
+        <w:ind w:left="461" w:hanging="461"/>
+      </w:pPr>
+      <w:r>
+        <w:rPr>
+          <w:b/>
+        </w:rPr>
+        <w:t>6.</w:t>
+      </w:r>
+      <w:r>
+        <w:t xml:space="preserve">  Arrange the layout — widgets snap into a responsive grid, refresh automatically, and can be removed with the trash icon.</w:t>
       </w:r>
     </w:p>
     <w:p>
@@ -2250,34 +3367,58 @@
     </w:p>
     <w:p>
       <w:pPr>
-        <w:pStyle w:val="ListNumber"/>
-      </w:pPr>
-      <w:r>
-        <w:t>In n8n, add a Webhook node to a new workflow, activate the workflow, and copy the webhook's Production URL.</w:t>
-      </w:r>
-    </w:p>
-    <w:p>
-      <w:pPr>
-        <w:pStyle w:val="ListNumber"/>
-      </w:pPr>
-      <w:r>
-        <w:t>In IoTFlow, create a new Automation and choose the trigger type: telemetry received, alert fired, device online/offline, or command sent.</w:t>
-      </w:r>
-    </w:p>
-    <w:p>
-      <w:pPr>
-        <w:pStyle w:val="ListNumber"/>
-      </w:pPr>
-      <w:r>
-        <w:t>Optionally narrow the trigger by device and metric (e.g. only temperature), then paste the n8n webhook URL and save.</w:t>
-      </w:r>
-    </w:p>
-    <w:p>
-      <w:pPr>
-        <w:pStyle w:val="ListNumber"/>
-      </w:pPr>
-      <w:r>
-        <w:t>Create an alert rule on a threshold (e.g. temperature &gt; 30) or device-offline, and hand it off to the automation.</w:t>
+        <w:ind w:left="461" w:hanging="461"/>
+      </w:pPr>
+      <w:r>
+        <w:rPr>
+          <w:b/>
+        </w:rPr>
+        <w:t>1.</w:t>
+      </w:r>
+      <w:r>
+        <w:t xml:space="preserve">  In n8n, add a Webhook node to a new workflow, activate the workflow, and copy the webhook's Production URL.</w:t>
+      </w:r>
+    </w:p>
+    <w:p>
+      <w:pPr>
+        <w:ind w:left="461" w:hanging="461"/>
+      </w:pPr>
+      <w:r>
+        <w:rPr>
+          <w:b/>
+        </w:rPr>
+        <w:t>2.</w:t>
+      </w:r>
+      <w:r>
+        <w:t xml:space="preserve">  In IoTFlow, create a new Automation and choose the trigger type: telemetry received, alert fired, device online/offline, or command sent.</w:t>
+      </w:r>
+    </w:p>
+    <w:p>
+      <w:pPr>
+        <w:ind w:left="461" w:hanging="461"/>
+      </w:pPr>
+      <w:r>
+        <w:rPr>
+          <w:b/>
+        </w:rPr>
+        <w:t>3.</w:t>
+      </w:r>
+      <w:r>
+        <w:t xml:space="preserve">  Optionally narrow the trigger by device and metric (e.g. only temperature), then paste the n8n webhook URL and save.</w:t>
+      </w:r>
+    </w:p>
+    <w:p>
+      <w:pPr>
+        <w:ind w:left="461" w:hanging="461"/>
+      </w:pPr>
+      <w:r>
+        <w:rPr>
+          <w:b/>
+        </w:rPr>
+        <w:t>4.</w:t>
+      </w:r>
+      <w:r>
+        <w:t xml:space="preserve">  Create an alert rule on a threshold (e.g. temperature &gt; 30) or device-offline, and hand it off to the automation.</w:t>
       </w:r>
     </w:p>
     <w:p>
@@ -2292,34 +3433,58 @@
     </w:p>
     <w:p>
       <w:pPr>
-        <w:pStyle w:val="ListNumber"/>
-      </w:pPr>
-      <w:r>
-        <w:t>Use Test to send a sample payload to n8n, inspect the JSON the webhook receives, then enable live triggering.</w:t>
-      </w:r>
-    </w:p>
-    <w:p>
-      <w:pPr>
-        <w:pStyle w:val="ListNumber"/>
-      </w:pPr>
-      <w:r>
-        <w:t>In n8n, branch the flow: send an Email/Telegram/WhatsApp notification and append the reading to Google Sheets.</w:t>
-      </w:r>
-    </w:p>
-    <w:p>
-      <w:pPr>
-        <w:pStyle w:val="ListNumber"/>
-      </w:pPr>
-      <w:r>
-        <w:t>Add an AI node to summarise the readings and recommend an action — AI-powered analytics with zero code.</w:t>
-      </w:r>
-    </w:p>
-    <w:p>
-      <w:pPr>
-        <w:pStyle w:val="ListNumber"/>
-      </w:pPr>
-      <w:r>
-        <w:t>Close the loop: add an HTTP Request node that sends a downlink command back to the device (e.g. switch a fan on).</w:t>
+        <w:ind w:left="461" w:hanging="461"/>
+      </w:pPr>
+      <w:r>
+        <w:rPr>
+          <w:b/>
+        </w:rPr>
+        <w:t>5.</w:t>
+      </w:r>
+      <w:r>
+        <w:t xml:space="preserve">  Use Test to send a sample payload to n8n, inspect the JSON the webhook receives, then enable live triggering.</w:t>
+      </w:r>
+    </w:p>
+    <w:p>
+      <w:pPr>
+        <w:ind w:left="461" w:hanging="461"/>
+      </w:pPr>
+      <w:r>
+        <w:rPr>
+          <w:b/>
+        </w:rPr>
+        <w:t>6.</w:t>
+      </w:r>
+      <w:r>
+        <w:t xml:space="preserve">  In n8n, branch the flow: send an Email/Telegram/WhatsApp notification and append the reading to Google Sheets.</w:t>
+      </w:r>
+    </w:p>
+    <w:p>
+      <w:pPr>
+        <w:ind w:left="461" w:hanging="461"/>
+      </w:pPr>
+      <w:r>
+        <w:rPr>
+          <w:b/>
+        </w:rPr>
+        <w:t>7.</w:t>
+      </w:r>
+      <w:r>
+        <w:t xml:space="preserve">  Add an AI node to summarise the readings and recommend an action — AI-powered analytics with zero code.</w:t>
+      </w:r>
+    </w:p>
+    <w:p>
+      <w:pPr>
+        <w:ind w:left="461" w:hanging="461"/>
+      </w:pPr>
+      <w:r>
+        <w:rPr>
+          <w:b/>
+        </w:rPr>
+        <w:t>8.</w:t>
+      </w:r>
+      <w:r>
+        <w:t xml:space="preserve">  Close the loop: add an HTTP Request node that sends a downlink command back to the device (e.g. switch a fan on).</w:t>
       </w:r>
     </w:p>
     <w:p>

</xml_diff>